<commit_message>
Penyelarasan ejaan tokoh: Hassan al-Banna ditukar kepada Hasan al-Banna (S tunggal)
</commit_message>
<xml_diff>
--- a/MUTIARA_KATA_HIKMAH_AL_RAQAIQ.docx
+++ b/MUTIARA_KATA_HIKMAH_AL_RAQAIQ.docx
@@ -2753,7 +2753,7 @@
           <w:color w:val="081C15"/>
           <w:sz w:val="24"/>
         </w:rPr>
-        <w:t>💎 Mutiara 34: Imam Hassan al-Banna rahimahullah</w:t>
+        <w:t>💎 Mutiara 34: Imam Hasan al-Banna rahimahullah</w:t>
       </w:r>
     </w:p>
     <w:p>
@@ -4955,7 +4955,7 @@
           <w:color w:val="081C15"/>
           <w:sz w:val="24"/>
         </w:rPr>
-        <w:t>💎 Mutiara 61: Imam Hassan al-Banna rahimahullah</w:t>
+        <w:t>💎 Mutiara 61: Imam Hasan al-Banna rahimahullah</w:t>
       </w:r>
     </w:p>
     <w:p>
@@ -7651,7 +7651,7 @@
           <w:color w:val="081C15"/>
           <w:sz w:val="24"/>
         </w:rPr>
-        <w:t>💎 Mutiara 94: Imam Hassan al-Banna rahimahullah</w:t>
+        <w:t>💎 Mutiara 94: Imam Hasan al-Banna rahimahullah</w:t>
       </w:r>
     </w:p>
     <w:p>
@@ -8705,7 +8705,7 @@
           <w:color w:val="081C15"/>
           <w:sz w:val="24"/>
         </w:rPr>
-        <w:t>💎 Mutiara 107: Imam Hassan al-Banna rahimahullah</w:t>
+        <w:t>💎 Mutiara 107: Imam Hasan al-Banna rahimahullah</w:t>
       </w:r>
     </w:p>
     <w:p>
@@ -9519,7 +9519,7 @@
           <w:color w:val="081C15"/>
           <w:sz w:val="24"/>
         </w:rPr>
-        <w:t>💎 Mutiara 117: Imam Hassan al-Banna rahimahullah</w:t>
+        <w:t>💎 Mutiara 117: Imam Hasan al-Banna rahimahullah</w:t>
       </w:r>
     </w:p>
     <w:p>

</xml_diff>

<commit_message>
Penyelarasan ejaan: 'Islam' menggantikan 'Islamiah', pembaikan bait syair Mutiara Kata, dan kemas kini v20 PWA
</commit_message>
<xml_diff>
--- a/MUTIARA_KATA_HIKMAH_AL_RAQAIQ.docx
+++ b/MUTIARA_KATA_HIKMAH_AL_RAQAIQ.docx
@@ -593,7 +593,7 @@
         <w:spacing w:before="40" w:after="40" w:line="276" w:lineRule="auto"/>
       </w:pPr>
       <w:r>
-        <w:t>*“Sesungguhnya hikmah Islamiah itu mengandungi kebenaran yang abadi; ia tidak melalui fasa evolusi yang muncul selepas zaman kejahilan, bahkan ia terbukti relevan sejak permulaan kehidupan manusia persis relevannya pada fasa penamat dunia.”*</w:t>
+        <w:t>*“Sesungguhnya hikmah Islam itu mengandungi kebenaran yang abadi; ia tidak melalui fasa evolusi yang muncul selepas zaman kejahilan, bahkan ia terbukti relevan sejak permulaan kehidupan manusia persis relevannya pada fasa penamat dunia.”*</w:t>
       </w:r>
     </w:p>
     <w:p>
@@ -617,7 +617,7 @@
         <w:spacing w:before="40" w:after="40" w:line="276" w:lineRule="auto"/>
       </w:pPr>
       <w:r>
-        <w:t>Keyakinan mutlak (*tsiqah*) terhadap keaslian dan kesempurnaan syariat Islam. Harakah Islamiah tidak perlu meminjam ideologi ciptaan manusia (seperti liberalisme atau sekularisme) untuk menyelesaikan krisis peradaban kontemporari.</w:t>
+        <w:t>Keyakinan mutlak (*tsiqah*) terhadap keaslian dan kesempurnaan syariat Islam. Harakah Islam tidak perlu meminjam ideologi ciptaan manusia (seperti liberalisme atau sekularisme) untuk menyelesaikan krisis peradaban kontemporari.</w:t>
       </w:r>
     </w:p>
     <w:p>
@@ -1407,7 +1407,7 @@
         <w:spacing w:before="40" w:after="40" w:line="276" w:lineRule="auto"/>
       </w:pPr>
       <w:r>
-        <w:t>*“Mana-mana gerakan dakwah yang mendakwa dirinya membawa panji Islamiah tidak akan dapat mengukuhkan kekuasaannya pada hari ini dan tidak akan beroleh kemenangan selagi mana para anggotanya tidak bertasbih memuji Allah pada waktu petang dan pagi sepertimana Nabi Daud AS bertasbih.”*</w:t>
+        <w:t>*“Mana-mana gerakan dakwah yang mendakwa dirinya membawa panji Islam tidak akan dapat mengukuhkan kekuasaannya pada hari ini dan tidak akan beroleh kemenangan selagi mana para anggotanya tidak bertasbih memuji Allah pada waktu petang dan pagi sepertimana Nabi Daud AS bertasbih.”*</w:t>
       </w:r>
     </w:p>
     <w:p>
@@ -1431,7 +1431,7 @@
         <w:spacing w:before="40" w:after="40" w:line="276" w:lineRule="auto"/>
       </w:pPr>
       <w:r>
-        <w:t>Formula kemenangan siasah Islamiah: kekuasaan politik (syaddul mulk) tidak akan tertegak dengan taktik percaturan semata-mata, melainkan diperkukuh dengan rintihan zikir, rukuk, dan tasbih para pejuangnya.</w:t>
+        <w:t>Formula kemenangan siasah Islam: kekuasaan politik (syaddul mulk) tidak akan tertegak dengan taktik percaturan semata-mata, melainkan diperkukuh dengan rintihan zikir, rukuk, dan tasbih para pejuangnya.</w:t>
       </w:r>
     </w:p>
     <w:p>
@@ -3313,7 +3313,7 @@
         <w:spacing w:before="40" w:after="40" w:line="276" w:lineRule="auto"/>
       </w:pPr>
       <w:r>
-        <w:t>Hukum penyerahan total: dakwah Islamiah enggan menerima sisa-sisa waktu terluang; ia menuntut seluruh potensi akal, masa, dan kewangan seorang aktivis.</w:t>
+        <w:t>Hukum penyerahan total: dakwah Islam enggan menerima sisa-sisa waktu terluang; ia menuntut seluruh potensi akal, masa, dan kewangan seorang aktivis.</w:t>
       </w:r>
     </w:p>
     <w:p>
@@ -4447,7 +4447,7 @@
         <w:spacing w:before="40" w:after="40" w:line="276" w:lineRule="auto"/>
       </w:pPr>
       <w:r>
-        <w:t>Peleburan asabiah kaum: ikatan harakah Islamiah meruntuhkan tembok perkauman, nasionalisme sempit, dan darjat keturunan demi menegakkan persaudaraan akidah sejagat.</w:t>
+        <w:t>Peleburan asabiah kaum: ikatan harakah Islam meruntuhkan tembok perkauman, nasionalisme sempit, dan darjat keturunan demi menegakkan persaudaraan akidah sejagat.</w:t>
       </w:r>
     </w:p>
     <w:p>
@@ -4861,7 +4861,7 @@
         <w:spacing w:before="40" w:after="40" w:line="276" w:lineRule="auto"/>
       </w:pPr>
       <w:r>
-        <w:t>Fungsi mehnah dan ujian: ujian penindasan yang menimpa gerakan Islamiah bukanlah untuk membinasakannya, tetapi untuk memperdalam cengkaman akar akidah para anggotanya agar kebal daripada fitnah.</w:t>
+        <w:t>Fungsi mehnah dan ujian: ujian penindasan yang menimpa gerakan Islam bukanlah untuk membinasakannya, tetapi untuk memperdalam cengkaman akar akidah para anggotanya agar kebal daripada fitnah.</w:t>
       </w:r>
     </w:p>
     <w:p>
@@ -8037,7 +8037,7 @@
         <w:spacing w:before="40" w:after="40" w:line="276" w:lineRule="auto"/>
       </w:pPr>
       <w:r>
-        <w:t>Syarat mutlak kemenangan haraki: menegakkan daulah Islamiah menuntut perajurit yang sanggup tidur berbantalkan lengan dan sanggup menanggung kelaparan demi mempertahankan prinsip.</w:t>
+        <w:t>Syarat mutlak kemenangan haraki: menegakkan daulah Islam menuntut perajurit yang sanggup tidur berbantalkan lengan dan sanggup menanggung kelaparan demi mempertahankan prinsip.</w:t>
       </w:r>
     </w:p>
     <w:p>

</xml_diff>